<commit_message>
Plan de pruebas actualizado en base al diseño, entrega intermedia
</commit_message>
<xml_diff>
--- a/Docs/pract03_planPruebas.docx
+++ b/Docs/pract03_planPruebas.docx
@@ -22,6 +22,7 @@
         </w:rPr>
         <w:t xml:space="preserve"> de la aplicación </w:t>
       </w:r>
+      <w:proofErr w:type="spellStart"/>
       <w:r>
         <w:rPr>
           <w:lang w:val="es-ES_tradnl"/>
@@ -34,6 +35,7 @@
         </w:rPr>
         <w:t>UC</w:t>
       </w:r>
+      <w:proofErr w:type="spellEnd"/>
     </w:p>
     <w:p>
       <w:pPr>
@@ -205,14 +207,7 @@
           <w:rFonts w:eastAsiaTheme="minorHAnsi" w:cs="Calibri"/>
           <w:color w:val="000000"/>
         </w:rPr>
-        <w:t xml:space="preserve">No existe disponibilidad para </w:t>
-      </w:r>
-      <w:r>
-        <w:rPr>
-          <w:rFonts w:eastAsiaTheme="minorHAnsi" w:cs="Calibri"/>
-          <w:color w:val="000000"/>
-        </w:rPr>
-        <w:t>alguna de las habitaciones de la reserva</w:t>
+        <w:t>No existe disponibilidad para alguna de las habitaciones de la reserva</w:t>
       </w:r>
     </w:p>
     <w:p>
@@ -232,21 +227,7 @@
           <w:rFonts w:eastAsiaTheme="minorHAnsi" w:cs="Calibri"/>
           <w:color w:val="000000"/>
         </w:rPr>
-        <w:t>d</w:t>
-      </w:r>
-      <w:r>
-        <w:rPr>
-          <w:rFonts w:eastAsiaTheme="minorHAnsi" w:cs="Calibri"/>
-          <w:color w:val="000000"/>
-        </w:rPr>
-        <w:t xml:space="preserve">. </w:t>
-      </w:r>
-      <w:r>
-        <w:rPr>
-          <w:rFonts w:eastAsiaTheme="minorHAnsi" w:cs="Calibri"/>
-          <w:color w:val="000000"/>
-        </w:rPr>
-        <w:t>Error en el acceso a datos</w:t>
+        <w:t>d. Error en el acceso a datos</w:t>
       </w:r>
     </w:p>
     <w:p>
@@ -334,11 +315,16 @@
         <w:jc w:val="both"/>
       </w:pPr>
       <w:r>
-        <w:t>Método crea</w:t>
+        <w:t xml:space="preserve">Método </w:t>
+      </w:r>
+      <w:proofErr w:type="spellStart"/>
+      <w:r>
+        <w:t>crea</w:t>
       </w:r>
       <w:r>
         <w:t>Reserva</w:t>
       </w:r>
+      <w:proofErr w:type="spellEnd"/>
       <w:r>
         <w:t>:</w:t>
       </w:r>
@@ -352,8 +338,8 @@
       </w:tblPr>
       <w:tblGrid>
         <w:gridCol w:w="1641"/>
-        <w:gridCol w:w="4733"/>
-        <w:gridCol w:w="2108"/>
+        <w:gridCol w:w="3457"/>
+        <w:gridCol w:w="3384"/>
       </w:tblGrid>
       <w:tr>
         <w:trPr>
@@ -376,7 +362,7 @@
         </w:tc>
         <w:tc>
           <w:tcPr>
-            <w:tcW w:w="4733" w:type="dxa"/>
+            <w:tcW w:w="3457" w:type="dxa"/>
           </w:tcPr>
           <w:p>
             <w:pPr>
@@ -391,7 +377,7 @@
         </w:tc>
         <w:tc>
           <w:tcPr>
-            <w:tcW w:w="1825" w:type="dxa"/>
+            <w:tcW w:w="3384" w:type="dxa"/>
           </w:tcPr>
           <w:p>
             <w:pPr>
@@ -432,7 +418,7 @@
         </w:tc>
         <w:tc>
           <w:tcPr>
-            <w:tcW w:w="4733" w:type="dxa"/>
+            <w:tcW w:w="3457" w:type="dxa"/>
           </w:tcPr>
           <w:p>
             <w:pPr>
@@ -447,7 +433,22 @@
               <w:t>[</w:t>
             </w:r>
             <w:r>
-              <w:t>0001, -</w:t>
+              <w:t>0001</w:t>
+            </w:r>
+            <w:r>
+              <w:t xml:space="preserve">, </w:t>
+            </w:r>
+            <w:r>
+              <w:t>XX-XX-XXXX</w:t>
+            </w:r>
+            <w:r>
+              <w:t>,</w:t>
+            </w:r>
+            <w:r>
+              <w:t xml:space="preserve"> </w:t>
+            </w:r>
+            <w:r>
+              <w:t>XX-XX-XXXX</w:t>
             </w:r>
             <w:r>
               <w:t>]</w:t>
@@ -469,7 +470,7 @@
         </w:tc>
         <w:tc>
           <w:tcPr>
-            <w:tcW w:w="1825" w:type="dxa"/>
+            <w:tcW w:w="3384" w:type="dxa"/>
           </w:tcPr>
           <w:p>
             <w:pPr>
@@ -478,13 +479,7 @@
               <w:jc w:val="both"/>
             </w:pPr>
             <w:r>
-              <w:t>[</w:t>
-            </w:r>
-            <w:r>
-              <w:t>0001, -</w:t>
-            </w:r>
-            <w:r>
-              <w:t>]</w:t>
+              <w:t>[0001, XX-XX-XXXX, XX-XX-XXXX]</w:t>
             </w:r>
           </w:p>
         </w:tc>
@@ -510,16 +505,13 @@
               <w:t>D</w:t>
             </w:r>
             <w:r>
-              <w:t>.1</w:t>
-            </w:r>
-            <w:r>
-              <w:t>b</w:t>
+              <w:t>.1b</w:t>
             </w:r>
           </w:p>
         </w:tc>
         <w:tc>
           <w:tcPr>
-            <w:tcW w:w="4733" w:type="dxa"/>
+            <w:tcW w:w="3457" w:type="dxa"/>
           </w:tcPr>
           <w:p>
             <w:pPr>
@@ -528,7 +520,7 @@
               <w:jc w:val="both"/>
             </w:pPr>
             <w:r>
-              <w:t>([0001, -])</w:t>
+              <w:t>([0001, XX-XX-XXXX, XX-XX-XXXX])</w:t>
             </w:r>
           </w:p>
           <w:p>
@@ -544,7 +536,7 @@
         </w:tc>
         <w:tc>
           <w:tcPr>
-            <w:tcW w:w="1825" w:type="dxa"/>
+            <w:tcW w:w="3384" w:type="dxa"/>
           </w:tcPr>
           <w:p>
             <w:pPr>
@@ -585,16 +577,13 @@
               <w:t>D</w:t>
             </w:r>
             <w:r>
-              <w:t>.1</w:t>
-            </w:r>
-            <w:r>
-              <w:t>c</w:t>
+              <w:t>.1c</w:t>
             </w:r>
           </w:p>
         </w:tc>
         <w:tc>
           <w:tcPr>
-            <w:tcW w:w="4733" w:type="dxa"/>
+            <w:tcW w:w="3457" w:type="dxa"/>
           </w:tcPr>
           <w:p>
             <w:pPr>
@@ -603,13 +592,16 @@
               <w:jc w:val="both"/>
             </w:pPr>
             <w:r>
-              <w:t>null</w:t>
+              <w:t>N</w:t>
+            </w:r>
+            <w:r>
+              <w:t>ull</w:t>
             </w:r>
           </w:p>
         </w:tc>
         <w:tc>
           <w:tcPr>
-            <w:tcW w:w="1825" w:type="dxa"/>
+            <w:tcW w:w="3384" w:type="dxa"/>
           </w:tcPr>
           <w:p>
             <w:pPr>
@@ -650,16 +642,13 @@
               <w:t>D</w:t>
             </w:r>
             <w:r>
-              <w:t>.1</w:t>
-            </w:r>
-            <w:r>
-              <w:t>d</w:t>
+              <w:t>.1d</w:t>
             </w:r>
           </w:p>
         </w:tc>
         <w:tc>
           <w:tcPr>
-            <w:tcW w:w="4733" w:type="dxa"/>
+            <w:tcW w:w="3457" w:type="dxa"/>
           </w:tcPr>
           <w:p>
             <w:pPr>
@@ -668,13 +657,13 @@
               <w:jc w:val="both"/>
             </w:pPr>
             <w:r>
-              <w:t>([000</w:t>
-            </w:r>
-            <w:r>
-              <w:t>2</w:t>
-            </w:r>
-            <w:r>
-              <w:t>, -])</w:t>
+              <w:t xml:space="preserve">([0002, </w:t>
+            </w:r>
+            <w:r>
+              <w:t>XX-XX-XXXX, XX-XX-XXXX</w:t>
+            </w:r>
+            <w:r>
+              <w:t>])</w:t>
             </w:r>
           </w:p>
           <w:p>
@@ -690,7 +679,7 @@
         </w:tc>
         <w:tc>
           <w:tcPr>
-            <w:tcW w:w="1825" w:type="dxa"/>
+            <w:tcW w:w="3384" w:type="dxa"/>
           </w:tcPr>
           <w:p>
             <w:pPr>
@@ -701,9 +690,11 @@
                 <w:color w:val="FF0000"/>
               </w:rPr>
             </w:pPr>
+            <w:proofErr w:type="spellStart"/>
             <w:r>
               <w:t>DataAccessException</w:t>
             </w:r>
+            <w:proofErr w:type="spellEnd"/>
           </w:p>
         </w:tc>
       </w:tr>
@@ -766,9 +757,11 @@
       <w:r>
         <w:t xml:space="preserve">Método </w:t>
       </w:r>
+      <w:proofErr w:type="spellStart"/>
       <w:r>
-        <w:t>reservar</w:t>
+        <w:t>consultarHabitacionesHotel</w:t>
       </w:r>
+      <w:proofErr w:type="spellEnd"/>
       <w:r>
         <w:t>:</w:t>
       </w:r>
@@ -782,8 +775,8 @@
       </w:tblPr>
       <w:tblGrid>
         <w:gridCol w:w="1696"/>
-        <w:gridCol w:w="4678"/>
-        <w:gridCol w:w="2108"/>
+        <w:gridCol w:w="3402"/>
+        <w:gridCol w:w="3384"/>
       </w:tblGrid>
       <w:tr>
         <w:trPr>
@@ -806,7 +799,7 @@
         </w:tc>
         <w:tc>
           <w:tcPr>
-            <w:tcW w:w="4678" w:type="dxa"/>
+            <w:tcW w:w="3402" w:type="dxa"/>
           </w:tcPr>
           <w:p>
             <w:pPr>
@@ -821,7 +814,7 @@
         </w:tc>
         <w:tc>
           <w:tcPr>
-            <w:tcW w:w="2108" w:type="dxa"/>
+            <w:tcW w:w="3384" w:type="dxa"/>
           </w:tcPr>
           <w:p>
             <w:pPr>
@@ -856,29 +849,31 @@
         </w:tc>
         <w:tc>
           <w:tcPr>
-            <w:tcW w:w="4678" w:type="dxa"/>
+            <w:tcW w:w="3402" w:type="dxa"/>
           </w:tcPr>
           <w:p>
             <w:r>
-              <w:t>(1111, [0001, -])</w:t>
+              <w:t>(0001, hoy+1, hoy+4)</w:t>
             </w:r>
           </w:p>
           <w:p>
             <w:r>
-              <w:t xml:space="preserve">Nueva reserva </w:t>
-            </w:r>
-            <w:r>
-              <w:t>válida</w:t>
+              <w:t>Habitaciones con disponibilidad</w:t>
             </w:r>
           </w:p>
         </w:tc>
         <w:tc>
           <w:tcPr>
-            <w:tcW w:w="2108" w:type="dxa"/>
+            <w:tcW w:w="3384" w:type="dxa"/>
           </w:tcPr>
           <w:p>
             <w:r>
-              <w:t>[0001, -])</w:t>
+              <w:t>Habitaciones[*]</w:t>
+            </w:r>
+          </w:p>
+          <w:p>
+            <w:r>
+              <w:t>Lista con las habitaciones con disponibilidad</w:t>
             </w:r>
           </w:p>
         </w:tc>
@@ -898,31 +893,34 @@
               <w:jc w:val="both"/>
             </w:pPr>
             <w:r>
-              <w:t>UTN.1</w:t>
-            </w:r>
-            <w:r>
-              <w:t>b</w:t>
+              <w:t>UTN.1b</w:t>
             </w:r>
           </w:p>
         </w:tc>
         <w:tc>
           <w:tcPr>
-            <w:tcW w:w="4678" w:type="dxa"/>
+            <w:tcW w:w="3402" w:type="dxa"/>
           </w:tcPr>
           <w:p>
             <w:r>
-              <w:t>(1111, [0001, -])</w:t>
+              <w:t>(000</w:t>
+            </w:r>
+            <w:r>
+              <w:t>2</w:t>
+            </w:r>
+            <w:r>
+              <w:t>, hoy+1, hoy+4)</w:t>
             </w:r>
           </w:p>
           <w:p>
             <w:r>
-              <w:t>Reserva existe</w:t>
+              <w:t>Hotel no existe</w:t>
             </w:r>
           </w:p>
         </w:tc>
         <w:tc>
           <w:tcPr>
-            <w:tcW w:w="2108" w:type="dxa"/>
+            <w:tcW w:w="3384" w:type="dxa"/>
           </w:tcPr>
           <w:p>
             <w:r>
@@ -955,37 +953,31 @@
         </w:tc>
         <w:tc>
           <w:tcPr>
-            <w:tcW w:w="4678" w:type="dxa"/>
+            <w:tcW w:w="3402" w:type="dxa"/>
           </w:tcPr>
           <w:p>
             <w:r>
-              <w:t>(111</w:t>
-            </w:r>
-            <w:r>
-              <w:t>2</w:t>
-            </w:r>
-            <w:r>
-              <w:t>, [000</w:t>
-            </w:r>
-            <w:r>
-              <w:t>2</w:t>
-            </w:r>
-            <w:r>
-              <w:t>, -])</w:t>
+              <w:t xml:space="preserve">(0001, </w:t>
+            </w:r>
+            <w:r>
+              <w:t>ayer</w:t>
+            </w:r>
+            <w:r>
+              <w:t>, hoy+4)</w:t>
             </w:r>
           </w:p>
           <w:p>
             <w:r>
-              <w:t xml:space="preserve">Nueva reserva </w:t>
-            </w:r>
-            <w:r>
-              <w:t>hotel no existe</w:t>
+              <w:t xml:space="preserve">Fecha entrada </w:t>
+            </w:r>
+            <w:r>
+              <w:t>ya pasada</w:t>
             </w:r>
           </w:p>
         </w:tc>
         <w:tc>
           <w:tcPr>
-            <w:tcW w:w="2108" w:type="dxa"/>
+            <w:tcW w:w="3384" w:type="dxa"/>
           </w:tcPr>
           <w:p>
             <w:r>
@@ -1018,37 +1010,40 @@
         </w:tc>
         <w:tc>
           <w:tcPr>
-            <w:tcW w:w="4678" w:type="dxa"/>
+            <w:tcW w:w="3402" w:type="dxa"/>
           </w:tcPr>
           <w:p>
             <w:r>
-              <w:t>(111</w:t>
-            </w:r>
-            <w:r>
-              <w:t>1</w:t>
-            </w:r>
-            <w:r>
-              <w:t>, [000</w:t>
-            </w:r>
-            <w:r>
-              <w:t>3</w:t>
-            </w:r>
-            <w:r>
-              <w:t>, -])</w:t>
+              <w:t xml:space="preserve">(0001, </w:t>
+            </w:r>
+            <w:r>
+              <w:t>hoy+4</w:t>
+            </w:r>
+            <w:r>
+              <w:t>,</w:t>
+            </w:r>
+            <w:r>
+              <w:t xml:space="preserve"> hoy</w:t>
+            </w:r>
+            <w:r>
+              <w:t>+2</w:t>
+            </w:r>
+            <w:r>
+              <w:t>)</w:t>
             </w:r>
           </w:p>
           <w:p>
             <w:r>
-              <w:t xml:space="preserve">Nueva reserva </w:t>
-            </w:r>
-            <w:r>
-              <w:t>fechas sin disponibilidad</w:t>
+              <w:t xml:space="preserve">Fecha </w:t>
+            </w:r>
+            <w:r>
+              <w:t>salida previa a entrada</w:t>
             </w:r>
           </w:p>
         </w:tc>
         <w:tc>
           <w:tcPr>
-            <w:tcW w:w="2108" w:type="dxa"/>
+            <w:tcW w:w="3384" w:type="dxa"/>
           </w:tcPr>
           <w:p>
             <w:r>
@@ -1081,37 +1076,31 @@
         </w:tc>
         <w:tc>
           <w:tcPr>
-            <w:tcW w:w="4678" w:type="dxa"/>
+            <w:tcW w:w="3402" w:type="dxa"/>
           </w:tcPr>
           <w:p>
             <w:r>
-              <w:t>(111</w:t>
-            </w:r>
-            <w:r>
-              <w:t>1</w:t>
-            </w:r>
-            <w:r>
-              <w:t>, [000</w:t>
+              <w:t>(0001, hoy+4, hoy+</w:t>
             </w:r>
             <w:r>
               <w:t>4</w:t>
             </w:r>
             <w:r>
-              <w:t>, -])</w:t>
+              <w:t>)</w:t>
             </w:r>
           </w:p>
           <w:p>
             <w:r>
-              <w:t xml:space="preserve">Nueva reserva </w:t>
-            </w:r>
-            <w:r>
-              <w:t>habitaciones sin disponibilidad</w:t>
+              <w:t xml:space="preserve">Fecha </w:t>
+            </w:r>
+            <w:r>
+              <w:t>entrada igual a salida</w:t>
             </w:r>
           </w:p>
         </w:tc>
         <w:tc>
           <w:tcPr>
-            <w:tcW w:w="2108" w:type="dxa"/>
+            <w:tcW w:w="3384" w:type="dxa"/>
           </w:tcPr>
           <w:p>
             <w:r>
@@ -1144,39 +1133,100 @@
         </w:tc>
         <w:tc>
           <w:tcPr>
-            <w:tcW w:w="4678" w:type="dxa"/>
+            <w:tcW w:w="3402" w:type="dxa"/>
           </w:tcPr>
           <w:p>
             <w:r>
-              <w:t>(111</w:t>
-            </w:r>
-            <w:r>
-              <w:t>1</w:t>
-            </w:r>
-            <w:r>
-              <w:t>, [000</w:t>
-            </w:r>
-            <w:r>
-              <w:t>5</w:t>
-            </w:r>
-            <w:r>
-              <w:t>, -])</w:t>
+              <w:t>(000</w:t>
+            </w:r>
+            <w:r>
+              <w:t>3, hoy+1,</w:t>
+            </w:r>
+            <w:r>
+              <w:t xml:space="preserve"> hoy+4)</w:t>
             </w:r>
           </w:p>
           <w:p>
             <w:r>
-              <w:t>Error en el acceso a datos</w:t>
+              <w:t>No hay habitaciones disponibles</w:t>
             </w:r>
           </w:p>
         </w:tc>
         <w:tc>
           <w:tcPr>
-            <w:tcW w:w="2108" w:type="dxa"/>
+            <w:tcW w:w="3384" w:type="dxa"/>
           </w:tcPr>
           <w:p>
             <w:r>
+              <w:t>Habitaciones[</w:t>
+            </w:r>
+            <w:r>
+              <w:t>0</w:t>
+            </w:r>
+            <w:r>
+              <w:t>]</w:t>
+            </w:r>
+          </w:p>
+          <w:p>
+            <w:r>
+              <w:t>Lista de habitaciones vacía</w:t>
+            </w:r>
+          </w:p>
+        </w:tc>
+      </w:tr>
+      <w:tr>
+        <w:trPr>
+          <w:jc w:val="center"/>
+        </w:trPr>
+        <w:tc>
+          <w:tcPr>
+            <w:tcW w:w="1696" w:type="dxa"/>
+          </w:tcPr>
+          <w:p>
+            <w:pPr>
+              <w:pStyle w:val="Prrafodelista"/>
+              <w:ind w:left="0"/>
+              <w:jc w:val="both"/>
+            </w:pPr>
+            <w:r>
+              <w:t>UTN.1</w:t>
+            </w:r>
+            <w:r>
+              <w:t>g</w:t>
+            </w:r>
+          </w:p>
+        </w:tc>
+        <w:tc>
+          <w:tcPr>
+            <w:tcW w:w="3402" w:type="dxa"/>
+          </w:tcPr>
+          <w:p>
+            <w:r>
+              <w:t>(000</w:t>
+            </w:r>
+            <w:r>
+              <w:t>1</w:t>
+            </w:r>
+            <w:r>
+              <w:t>, hoy+1, hoy+4)</w:t>
+            </w:r>
+          </w:p>
+          <w:p>
+            <w:r>
+              <w:t>Error en el acceso a datos</w:t>
+            </w:r>
+          </w:p>
+        </w:tc>
+        <w:tc>
+          <w:tcPr>
+            <w:tcW w:w="3384" w:type="dxa"/>
+          </w:tcPr>
+          <w:p>
+            <w:proofErr w:type="spellStart"/>
+            <w:r>
               <w:t>DataAccessException</w:t>
             </w:r>
+            <w:proofErr w:type="spellEnd"/>
           </w:p>
         </w:tc>
       </w:tr>
@@ -6796,7 +6846,7 @@
   <w:style w:type="paragraph" w:default="1" w:styleId="Normal">
     <w:name w:val="Normal"/>
     <w:qFormat/>
-    <w:rsid w:val="00600375"/>
+    <w:rsid w:val="003860A8"/>
     <w:rPr>
       <w:rFonts w:ascii="Calibri" w:eastAsia="Calibri" w:hAnsi="Calibri" w:cs="Times New Roman"/>
     </w:rPr>

</xml_diff>